<commit_message>
Split pupil guide into IGCSE and A Level; update F Block Spanish sheet for set drills; add online versions of all guides
Co-Authored-By: Claude Sonnet 5.5 <noreply@anthropic.com>
Claude-Session: https://claude.ai/code/session_01HQewUzsAu4omaG8JGsraHZ
</commit_message>
<xml_diff>
--- a/Word documents/AP_F_Block_Spanish_Start_Here.docx
+++ b/Word documents/AP_F_Block_Spanish_Start_Here.docx
@@ -1112,6 +1112,186 @@
         <w:t xml:space="preserve"/>
       </w:r>
     </w:p>
+    <w:p>
+      <w:pPr>
+        <w:pStyle w:val="Heading2"/>
+        <w:keepNext/>
+        <w:spacing w:after="120" w:before="320"/>
+      </w:pPr>
+      <w:r>
+        <w:rPr>
+          <w:rFonts w:ascii="Arial" w:cs="Arial" w:eastAsia="Arial" w:hAnsi="Arial"/>
+          <w:b/>
+          <w:bCs/>
+          <w:color w:val="1F3864"/>
+          <w:sz w:val="28"/>
+          <w:szCs w:val="28"/>
+        </w:rPr>
+        <w:t xml:space="preserve">If AP sets you a drill</w:t>
+      </w:r>
+    </w:p>
+    <w:p>
+      <w:pPr>
+        <w:pStyle w:val="ListParagraph"/>
+        <w:numPr>
+          <w:ilvl w:val="0"/>
+          <w:numId w:val="3"/>
+        </w:numPr>
+        <w:spacing w:after="60" w:line="276"/>
+      </w:pPr>
+      <w:r>
+        <w:rPr>
+          <w:rFonts w:ascii="Arial" w:cs="Arial" w:eastAsia="Arial" w:hAnsi="Arial"/>
+          <w:sz w:val="22"/>
+          <w:szCs w:val="22"/>
+        </w:rPr>
+        <w:t xml:space="preserve">AP can send you a </w:t>
+      </w:r>
+      <w:r>
+        <w:rPr>
+          <w:rFonts w:ascii="Arial" w:cs="Arial" w:eastAsia="Arial" w:hAnsi="Arial"/>
+          <w:b/>
+          <w:bCs/>
+          <w:sz w:val="22"/>
+          <w:szCs w:val="22"/>
+        </w:rPr>
+        <w:t xml:space="preserve">link</w:t>
+      </w:r>
+      <w:r>
+        <w:rPr>
+          <w:rFonts w:ascii="Arial" w:cs="Arial" w:eastAsia="Arial" w:hAnsi="Arial"/>
+          <w:sz w:val="22"/>
+          <w:szCs w:val="22"/>
+        </w:rPr>
+        <w:t xml:space="preserve">, or give you a </w:t>
+      </w:r>
+      <w:r>
+        <w:rPr>
+          <w:rFonts w:ascii="Arial" w:cs="Arial" w:eastAsia="Arial" w:hAnsi="Arial"/>
+          <w:b/>
+          <w:bCs/>
+          <w:sz w:val="22"/>
+          <w:szCs w:val="22"/>
+        </w:rPr>
+        <w:t xml:space="preserve">code</w:t>
+      </w:r>
+      <w:r>
+        <w:rPr>
+          <w:rFonts w:ascii="Arial" w:cs="Arial" w:eastAsia="Arial" w:hAnsi="Arial"/>
+          <w:sz w:val="22"/>
+          <w:szCs w:val="22"/>
+        </w:rPr>
+        <w:t xml:space="preserve"> to type on the AP Tests page (it starts </w:t>
+      </w:r>
+      <w:r>
+        <w:rPr>
+          <w:rFonts w:ascii="Arial" w:cs="Arial" w:eastAsia="Arial" w:hAnsi="Arial"/>
+          <w:b/>
+          <w:bCs/>
+          <w:sz w:val="22"/>
+          <w:szCs w:val="22"/>
+        </w:rPr>
+        <w:t xml:space="preserve">DRS</w:t>
+      </w:r>
+      <w:r>
+        <w:rPr>
+          <w:rFonts w:ascii="Arial" w:cs="Arial" w:eastAsia="Arial" w:hAnsi="Arial"/>
+          <w:sz w:val="22"/>
+          <w:szCs w:val="22"/>
+        </w:rPr>
+        <w:t xml:space="preserve">, for example </w:t>
+      </w:r>
+      <w:r>
+        <w:rPr>
+          <w:rFonts w:ascii="Arial" w:cs="Arial" w:eastAsia="Arial" w:hAnsi="Arial"/>
+          <w:b/>
+          <w:bCs/>
+          <w:sz w:val="22"/>
+          <w:szCs w:val="22"/>
+        </w:rPr>
+        <w:t xml:space="preserve">DRS101</w:t>
+      </w:r>
+      <w:r>
+        <w:rPr>
+          <w:rFonts w:ascii="Arial" w:cs="Arial" w:eastAsia="Arial" w:hAnsi="Arial"/>
+          <w:sz w:val="22"/>
+          <w:szCs w:val="22"/>
+        </w:rPr>
+        <w:t xml:space="preserve">). It opens AP F Spanish Vocab </w:t>
+      </w:r>
+      <w:r>
+        <w:rPr>
+          <w:rFonts w:ascii="Arial" w:cs="Arial" w:eastAsia="Arial" w:hAnsi="Arial"/>
+          <w:b/>
+          <w:bCs/>
+          <w:sz w:val="22"/>
+          <w:szCs w:val="22"/>
+        </w:rPr>
+        <w:t xml:space="preserve">straight into a drill that AP has chosen</w:t>
+      </w:r>
+      <w:r>
+        <w:rPr>
+          <w:rFonts w:ascii="Arial" w:cs="Arial" w:eastAsia="Arial" w:hAnsi="Arial"/>
+          <w:sz w:val="22"/>
+          <w:szCs w:val="22"/>
+        </w:rPr>
+        <w:t xml:space="preserve">: the topics, the direction and the number of cards are already set.</w:t>
+      </w:r>
+    </w:p>
+    <w:p>
+      <w:pPr>
+        <w:pStyle w:val="ListParagraph"/>
+        <w:numPr>
+          <w:ilvl w:val="0"/>
+          <w:numId w:val="3"/>
+        </w:numPr>
+        <w:spacing w:after="60" w:line="276"/>
+      </w:pPr>
+      <w:r>
+        <w:rPr>
+          <w:rFonts w:ascii="Arial" w:cs="Arial" w:eastAsia="Arial" w:hAnsi="Arial"/>
+          <w:sz w:val="22"/>
+          <w:szCs w:val="22"/>
+        </w:rPr>
+        <w:t xml:space="preserve">A dark bar says </w:t>
+      </w:r>
+      <w:r>
+        <w:rPr>
+          <w:rFonts w:ascii="Arial" w:cs="Arial" w:eastAsia="Arial" w:hAnsi="Arial"/>
+          <w:b/>
+          <w:bCs/>
+          <w:sz w:val="22"/>
+          <w:szCs w:val="22"/>
+        </w:rPr>
+        <w:t xml:space="preserve">"Drill set by AP"</w:t>
+      </w:r>
+      <w:r>
+        <w:rPr>
+          <w:rFonts w:ascii="Arial" w:cs="Arial" w:eastAsia="Arial" w:hAnsi="Arial"/>
+          <w:sz w:val="22"/>
+          <w:szCs w:val="22"/>
+        </w:rPr>
+        <w:t xml:space="preserve">. No timer, nothing logged: do it as normal. Press </w:t>
+      </w:r>
+      <w:r>
+        <w:rPr>
+          <w:rFonts w:ascii="Arial" w:cs="Arial" w:eastAsia="Arial" w:hAnsi="Arial"/>
+          <w:b/>
+          <w:bCs/>
+          <w:sz w:val="22"/>
+          <w:szCs w:val="22"/>
+        </w:rPr>
+        <w:t xml:space="preserve">✕ Free practice</w:t>
+      </w:r>
+      <w:r>
+        <w:rPr>
+          <w:rFonts w:ascii="Arial" w:cs="Arial" w:eastAsia="Arial" w:hAnsi="Arial"/>
+          <w:sz w:val="22"/>
+          <w:szCs w:val="22"/>
+        </w:rPr>
+        <w:t xml:space="preserve"> to choose your own topics. If the link "does not work", ask AP for it again.</w:t>
+      </w:r>
+    </w:p>
     <w:tbl>
       <w:tblPr>
         <w:tblW w:type="dxa" w:w="9638"/>
@@ -1236,7 +1416,7 @@
     </w:p>
     <w:sectPr>
       <w:pgSz w:w="11906" w:h="16838" w:orient="portrait"/>
-      <w:pgMar w:top="850" w:right="1134" w:bottom="850" w:left="1134" w:header="708" w:footer="708" w:gutter="0"/>
+      <w:pgMar w:top="700" w:right="1134" w:bottom="650" w:left="1134" w:header="708" w:footer="708" w:gutter="0"/>
       <w:pgNumType/>
       <w:docGrid w:linePitch="360"/>
     </w:sectPr>

</xml_diff>